<commit_message>
Sanitize Prerequisites doc: remove tenant-specific details and live-check results
</commit_message>
<xml_diff>
--- a/documents/Auto_FNOL_Prerequisites_and_Tenant_Readiness.docx
+++ b/documents/Auto_FNOL_Prerequisites_and_Tenant_Readiness.docx
@@ -20,19 +20,7 @@
           <w:i/>
           <w:sz w:val="26"/>
         </w:rPr>
-        <w:t>Insurance IQ Solution Accelerator | Step 2 of the design engagement</w:t>
-      </w:r>
-    </w:p>
-    <w:p>
-      <w:pPr>
-        <w:jc w:val="center"/>
-      </w:pPr>
-      <w:r>
-        <w:rPr>
-          <w:color w:val="808080"/>
-          <w:sz w:val="20"/>
-        </w:rPr>
-        <w:t>Tenant: sagarbathe@mngenvmcap146722.onmicrosoft.com  |  Subscription: ME-MngEnvMCAP146722-sagarbathe-1 (04054f52-6b7b-47c7-b836-005253626f42)</w:t>
+        <w:t>Insurance IQ Solution Accelerator</w:t>
       </w:r>
     </w:p>
     <w:p/>
@@ -41,7 +29,7 @@
         <w:rPr>
           <w:i/>
         </w:rPr>
-        <w:t>Per direction: Foundry IQ will use the existing resource group RG_openai and its Foundry-related services (do not create a new AI Foundry resource group). Fabric IQ will use the existing resource group RG_Fabric and its capacities/storage. The resource group rg-msft-iq must NOT be used for this build — it is reserved/out of scope and has been excluded from all recommendations below.</w:t>
+        <w:t>This checklist covers everything required in your own Microsoft 365 / Azure / Power Platform tenant before deploying the Auto FNOL Triage accelerator. It is deliberately generic: this repo does not hardcode any tenant-specific names, IDs, or endpoints - see .env.example and config.py at the repo root, and the Configuration section of the Deployment Guide, for how to plug in your own values.</w:t>
       </w:r>
     </w:p>
     <w:p>
@@ -65,7 +53,7 @@
         <w:pStyle w:val="ListBullet"/>
       </w:pPr>
       <w:r>
-        <w:t>An Azure subscription with Owner, or Contributor + User Access Administrator, at the subscription or target resource-group level (RG_openai, RG_Fabric).</w:t>
+        <w:t>An Azure subscription with Owner, or Contributor + User Access Administrator, at the subscription or target resource-group level.</w:t>
       </w:r>
     </w:p>
     <w:p>
@@ -89,7 +77,7 @@
         <w:pStyle w:val="Heading2"/>
       </w:pPr>
       <w:r>
-        <w:t>A.2 Microsoft Fabric (RG_Fabric)</w:t>
+        <w:t>A.2 Microsoft Fabric</w:t>
       </w:r>
     </w:p>
     <w:p>
@@ -97,7 +85,7 @@
         <w:pStyle w:val="ListBullet"/>
       </w:pPr>
       <w:r>
-        <w:t>An active Fabric capacity (F-SKU or trial) assigned to the workspace that will host the Auto FNOL lakehouse, semantic model, and Fabric Data (Ontology) Agent.</w:t>
+        <w:t>An active Fabric capacity (F-SKU or trial) assigned to the workspace that will host the Auto FNOL lakehouse, ontology/graph model, and Fabric Data (Ontology) Agent.</w:t>
       </w:r>
     </w:p>
     <w:p>
@@ -129,7 +117,7 @@
         <w:pStyle w:val="Heading2"/>
       </w:pPr>
       <w:r>
-        <w:t>A.3 Microsoft Foundry (RG_openai)</w:t>
+        <w:t>A.3 Microsoft Foundry</w:t>
       </w:r>
     </w:p>
     <w:p>
@@ -137,7 +125,7 @@
         <w:pStyle w:val="ListBullet"/>
       </w:pPr>
       <w:r>
-        <w:t>An Azure AI Foundry account/project with at least one chat-completion model deployment (e.g., GPT-4o) and one embedding model deployment (e.g., text-embedding-ada-002).</w:t>
+        <w:t>An Azure AI Foundry account/project with a chat model deployment (e.g. gpt-4o or gpt-5-mini) and an embedding model deployment (e.g. text-embedding-ada-002) used by foundry/build_search_index.py. Size the chat model's capacity high enough to avoid 429 throttling under concurrent use (validate with a load of a few requests/minute before wider rollout).</w:t>
       </w:r>
     </w:p>
     <w:p>
@@ -145,7 +133,7 @@
         <w:pStyle w:val="ListBullet"/>
       </w:pPr>
       <w:r>
-        <w:t>An Azure AI Search service for the knowledge-base index (policy wording, exclusions, state regulations, SIU playbook, ACV methodology documents).</w:t>
+        <w:t>An Azure AI Search service to host the knowledge base index for the policy wording, exclusions, state regulations, SIU playbook, and subrogation methodology documents.</w:t>
       </w:r>
     </w:p>
     <w:p>
@@ -161,7 +149,7 @@
         <w:pStyle w:val="ListBullet"/>
       </w:pPr>
       <w:r>
-        <w:t>A Key Vault to store connection secrets, referenced via managed identity.</w:t>
+        <w:t>A Key Vault to store connection secrets, referenced via managed identity where possible.</w:t>
       </w:r>
     </w:p>
     <w:p>
@@ -201,7 +189,7 @@
         <w:pStyle w:val="ListBullet"/>
       </w:pPr>
       <w:r>
-        <w:t>Power Automate entitlement sufficient for a Dataverse/premium-connector flow (email trigger + Copilot Studio invocation + Teams/Outlook actions).</w:t>
+        <w:t>Power Automate entitlement sufficient for a Dataverse/premium-connector flow (email trigger + Copilot Studio invocation + Teams/Outlook actions), if you extend the solution with an email-triggered workflow.</w:t>
       </w:r>
     </w:p>
     <w:p>
@@ -233,7 +221,7 @@
         <w:pStyle w:val="ListBullet"/>
       </w:pPr>
       <w:r>
-        <w:t>A monitored mailbox (shared mailbox or licensed account) to receive FNOL emails and trigger the Power Automate flow.</w:t>
+        <w:t>A monitored mailbox (shared mailbox or licensed account) if you plan to trigger the workflow from inbound FNOL emails.</w:t>
       </w:r>
     </w:p>
     <w:p>
@@ -241,7 +229,7 @@
         <w:pStyle w:val="ListBullet"/>
       </w:pPr>
       <w:r>
-        <w:t>Microsoft Teams enabled as a channel target so the agent can post adjuster notifications.</w:t>
+        <w:t>Microsoft Teams enabled as a channel target for the Copilot Studio agent.</w:t>
       </w:r>
     </w:p>
     <w:p>
@@ -257,7 +245,7 @@
         <w:pStyle w:val="ListBullet"/>
       </w:pPr>
       <w:r>
-        <w:t>Managed Identity used for all service-to-service authentication; no hardcoded secrets.</w:t>
+        <w:t>Managed Identity used for all service-to-service authentication where possible; no hardcoded secrets in source control (this repo's scripts read all tenant-specific values from a local .env file via config.py - see .env.example).</w:t>
       </w:r>
     </w:p>
     <w:p>
@@ -265,7 +253,7 @@
         <w:pStyle w:val="ListBullet"/>
       </w:pPr>
       <w:r>
-        <w:t>Azure Key Vault storing all connection secrets.</w:t>
+        <w:t>Azure Key Vault storing any connection secrets that can't use managed identity.</w:t>
       </w:r>
     </w:p>
     <w:p>
@@ -281,1378 +269,12 @@
         <w:pStyle w:val="Heading1"/>
       </w:pPr>
       <w:r>
-        <w:t>Part B — Tenant Readiness Assessment (Live Check)</w:t>
+        <w:t>Part B — Readiness Self-Check</w:t>
       </w:r>
     </w:p>
     <w:p>
       <w:r>
-        <w:t>The checks below were run directly against the target tenant/subscription using Azure CLI and Microsoft Graph on the date this document was generated.</w:t>
-      </w:r>
-    </w:p>
-    <w:p>
-      <w:pPr>
-        <w:pStyle w:val="Heading2"/>
-      </w:pPr>
-      <w:r>
-        <w:t>B.1 Azure subscription &amp; RBAC</w:t>
-      </w:r>
-    </w:p>
-    <w:tbl>
-      <w:tblPr>
-        <w:tblStyle w:val="TableGrid"/>
-        <w:tblW w:type="auto" w:w="0"/>
-        <w:jc w:val="center"/>
-        <w:tblLook w:firstColumn="1" w:firstRow="1" w:lastColumn="0" w:lastRow="0" w:noHBand="0" w:noVBand="1" w:val="04A0"/>
-      </w:tblPr>
-      <w:tblGrid>
-        <w:gridCol w:w="2880"/>
-        <w:gridCol w:w="2880"/>
-        <w:gridCol w:w="2880"/>
-      </w:tblGrid>
-      <w:tr>
-        <w:tc>
-          <w:tcPr>
-            <w:tcW w:type="dxa" w:w="2592"/>
-            <w:shd w:fill="1F4E78"/>
-          </w:tcPr>
-          <w:p>
-            <w:r>
-              <w:rPr>
-                <w:b/>
-                <w:color w:val="FFFFFF"/>
-                <w:sz w:val="20"/>
-              </w:rPr>
-              <w:t>Item</w:t>
-            </w:r>
-          </w:p>
-        </w:tc>
-        <w:tc>
-          <w:tcPr>
-            <w:tcW w:type="dxa" w:w="5760"/>
-            <w:shd w:fill="1F4E78"/>
-          </w:tcPr>
-          <w:p>
-            <w:r>
-              <w:rPr>
-                <w:b/>
-                <w:color w:val="FFFFFF"/>
-                <w:sz w:val="20"/>
-              </w:rPr>
-              <w:t>Result</w:t>
-            </w:r>
-          </w:p>
-        </w:tc>
-        <w:tc>
-          <w:tcPr>
-            <w:tcW w:type="dxa" w:w="1440"/>
-            <w:shd w:fill="1F4E78"/>
-          </w:tcPr>
-          <w:p>
-            <w:r>
-              <w:rPr>
-                <w:b/>
-                <w:color w:val="FFFFFF"/>
-                <w:sz w:val="20"/>
-              </w:rPr>
-              <w:t>Status</w:t>
-            </w:r>
-          </w:p>
-        </w:tc>
-      </w:tr>
-      <w:tr>
-        <w:tc>
-          <w:tcPr>
-            <w:tcW w:type="dxa" w:w="2592"/>
-          </w:tcPr>
-          <w:p>
-            <w:r>
-              <w:rPr>
-                <w:sz w:val="20"/>
-              </w:rPr>
-              <w:t>Subscription access</w:t>
-            </w:r>
-          </w:p>
-        </w:tc>
-        <w:tc>
-          <w:tcPr>
-            <w:tcW w:type="dxa" w:w="5760"/>
-          </w:tcPr>
-          <w:p>
-            <w:r>
-              <w:rPr>
-                <w:sz w:val="20"/>
-              </w:rPr>
-              <w:t>ME-MngEnvMCAP146722-sagarbathe-1 (04054f52-...26f42), state: Enabled</w:t>
-            </w:r>
-          </w:p>
-        </w:tc>
-        <w:tc>
-          <w:tcPr>
-            <w:tcW w:type="dxa" w:w="1440"/>
-          </w:tcPr>
-          <w:p>
-            <w:r>
-              <w:rPr>
-                <w:sz w:val="20"/>
-              </w:rPr>
-              <w:t>PASS</w:t>
-            </w:r>
-          </w:p>
-        </w:tc>
-      </w:tr>
-      <w:tr>
-        <w:tc>
-          <w:tcPr>
-            <w:tcW w:type="dxa" w:w="2592"/>
-          </w:tcPr>
-          <w:p>
-            <w:r>
-              <w:rPr>
-                <w:sz w:val="20"/>
-              </w:rPr>
-              <w:t>RBAC role</w:t>
-            </w:r>
-          </w:p>
-        </w:tc>
-        <w:tc>
-          <w:tcPr>
-            <w:tcW w:type="dxa" w:w="5760"/>
-          </w:tcPr>
-          <w:p>
-            <w:r>
-              <w:rPr>
-                <w:sz w:val="20"/>
-              </w:rPr>
-              <w:t>sagarbathe has Owner and User Access Administrator at the subscription scope</w:t>
-            </w:r>
-          </w:p>
-        </w:tc>
-        <w:tc>
-          <w:tcPr>
-            <w:tcW w:type="dxa" w:w="1440"/>
-          </w:tcPr>
-          <w:p>
-            <w:r>
-              <w:rPr>
-                <w:sz w:val="20"/>
-              </w:rPr>
-              <w:t>PASS</w:t>
-            </w:r>
-          </w:p>
-        </w:tc>
-      </w:tr>
-      <w:tr>
-        <w:tc>
-          <w:tcPr>
-            <w:tcW w:type="dxa" w:w="2592"/>
-          </w:tcPr>
-          <w:p>
-            <w:r>
-              <w:rPr>
-                <w:sz w:val="20"/>
-              </w:rPr>
-              <w:t>Resource providers</w:t>
-            </w:r>
-          </w:p>
-        </w:tc>
-        <w:tc>
-          <w:tcPr>
-            <w:tcW w:type="dxa" w:w="5760"/>
-          </w:tcPr>
-          <w:p>
-            <w:r>
-              <w:rPr>
-                <w:sz w:val="20"/>
-              </w:rPr>
-              <w:t>CognitiveServices, Search, KeyVault, App, ManagedIdentity, Fabric, OperationalInsights, Insights, MachineLearningServices, Web — all Registered</w:t>
-            </w:r>
-          </w:p>
-        </w:tc>
-        <w:tc>
-          <w:tcPr>
-            <w:tcW w:type="dxa" w:w="1440"/>
-          </w:tcPr>
-          <w:p>
-            <w:r>
-              <w:rPr>
-                <w:sz w:val="20"/>
-              </w:rPr>
-              <w:t>PASS</w:t>
-            </w:r>
-          </w:p>
-        </w:tc>
-      </w:tr>
-    </w:tbl>
-    <w:p>
-      <w:pPr>
-        <w:pStyle w:val="Heading2"/>
-      </w:pPr>
-      <w:r>
-        <w:t>B.2 Microsoft Fabric (RG_Fabric)</w:t>
-      </w:r>
-    </w:p>
-    <w:tbl>
-      <w:tblPr>
-        <w:tblStyle w:val="TableGrid"/>
-        <w:tblW w:type="auto" w:w="0"/>
-        <w:jc w:val="center"/>
-        <w:tblLook w:firstColumn="1" w:firstRow="1" w:lastColumn="0" w:lastRow="0" w:noHBand="0" w:noVBand="1" w:val="04A0"/>
-      </w:tblPr>
-      <w:tblGrid>
-        <w:gridCol w:w="2880"/>
-        <w:gridCol w:w="2880"/>
-        <w:gridCol w:w="2880"/>
-      </w:tblGrid>
-      <w:tr>
-        <w:tc>
-          <w:tcPr>
-            <w:tcW w:type="dxa" w:w="2592"/>
-            <w:shd w:fill="1F4E78"/>
-          </w:tcPr>
-          <w:p>
-            <w:r>
-              <w:rPr>
-                <w:b/>
-                <w:color w:val="FFFFFF"/>
-                <w:sz w:val="20"/>
-              </w:rPr>
-              <w:t>Item</w:t>
-            </w:r>
-          </w:p>
-        </w:tc>
-        <w:tc>
-          <w:tcPr>
-            <w:tcW w:type="dxa" w:w="6336"/>
-            <w:shd w:fill="1F4E78"/>
-          </w:tcPr>
-          <w:p>
-            <w:r>
-              <w:rPr>
-                <w:b/>
-                <w:color w:val="FFFFFF"/>
-                <w:sz w:val="20"/>
-              </w:rPr>
-              <w:t>Result</w:t>
-            </w:r>
-          </w:p>
-        </w:tc>
-        <w:tc>
-          <w:tcPr>
-            <w:tcW w:type="dxa" w:w="864"/>
-            <w:shd w:fill="1F4E78"/>
-          </w:tcPr>
-          <w:p>
-            <w:r>
-              <w:rPr>
-                <w:b/>
-                <w:color w:val="FFFFFF"/>
-                <w:sz w:val="20"/>
-              </w:rPr>
-              <w:t>Status</w:t>
-            </w:r>
-          </w:p>
-        </w:tc>
-      </w:tr>
-      <w:tr>
-        <w:tc>
-          <w:tcPr>
-            <w:tcW w:type="dxa" w:w="2592"/>
-          </w:tcPr>
-          <w:p>
-            <w:r>
-              <w:rPr>
-                <w:sz w:val="20"/>
-              </w:rPr>
-              <w:t>Fabric capacities available</w:t>
-            </w:r>
-          </w:p>
-        </w:tc>
-        <w:tc>
-          <w:tcPr>
-            <w:tcW w:type="dxa" w:w="6336"/>
-          </w:tcPr>
-          <w:p>
-            <w:r>
-              <w:rPr>
-                <w:sz w:val="20"/>
-              </w:rPr>
-              <w:t>3 capacities found in RG_Fabric: sbfabriccap01 (westus3), sbfabriccapeastus2 (eastus2), sbcapacityeastus (eastus). Any can be assigned to the FNOL workspace.</w:t>
-            </w:r>
-          </w:p>
-        </w:tc>
-        <w:tc>
-          <w:tcPr>
-            <w:tcW w:type="dxa" w:w="864"/>
-          </w:tcPr>
-          <w:p>
-            <w:r>
-              <w:rPr>
-                <w:sz w:val="20"/>
-              </w:rPr>
-              <w:t>PASS</w:t>
-            </w:r>
-          </w:p>
-        </w:tc>
-      </w:tr>
-      <w:tr>
-        <w:tc>
-          <w:tcPr>
-            <w:tcW w:type="dxa" w:w="2592"/>
-          </w:tcPr>
-          <w:p>
-            <w:r>
-              <w:rPr>
-                <w:sz w:val="20"/>
-              </w:rPr>
-              <w:t>Fabric workspace</w:t>
-            </w:r>
-          </w:p>
-        </w:tc>
-        <w:tc>
-          <w:tcPr>
-            <w:tcW w:type="dxa" w:w="6336"/>
-          </w:tcPr>
-          <w:p>
-            <w:r>
-              <w:rPr>
-                <w:sz w:val="20"/>
-              </w:rPr>
-              <w:t>An existing workspace ‘WS_AutoClaimsPOC’ was found in the tenant — likely a prior auto-claims proof of concept. Recommend confirming ownership/contents before reuse, or create a new workspace ‘WS_AutoFNOL’ assigned to a RG_Fabric capacity.</w:t>
-            </w:r>
-          </w:p>
-        </w:tc>
-        <w:tc>
-          <w:tcPr>
-            <w:tcW w:type="dxa" w:w="864"/>
-          </w:tcPr>
-          <w:p>
-            <w:r>
-              <w:rPr>
-                <w:sz w:val="20"/>
-              </w:rPr>
-              <w:t>ACTION NEEDED</w:t>
-            </w:r>
-          </w:p>
-        </w:tc>
-      </w:tr>
-      <w:tr>
-        <w:tc>
-          <w:tcPr>
-            <w:tcW w:type="dxa" w:w="2592"/>
-          </w:tcPr>
-          <w:p>
-            <w:r>
-              <w:rPr>
-                <w:sz w:val="20"/>
-              </w:rPr>
-              <w:t>SPN access to Fabric public APIs</w:t>
-            </w:r>
-          </w:p>
-        </w:tc>
-        <w:tc>
-          <w:tcPr>
-            <w:tcW w:type="dxa" w:w="6336"/>
-          </w:tcPr>
-          <w:p>
-            <w:r>
-              <w:rPr>
-                <w:sz w:val="20"/>
-              </w:rPr>
-              <w:t>Tenant setting ‘Service principals can call Fabric public APIs’ (ServicePrincipalAccessPermissionAPIs) = True</w:t>
-            </w:r>
-          </w:p>
-        </w:tc>
-        <w:tc>
-          <w:tcPr>
-            <w:tcW w:type="dxa" w:w="864"/>
-          </w:tcPr>
-          <w:p>
-            <w:r>
-              <w:rPr>
-                <w:sz w:val="20"/>
-              </w:rPr>
-              <w:t>PASS</w:t>
-            </w:r>
-          </w:p>
-        </w:tc>
-      </w:tr>
-      <w:tr>
-        <w:tc>
-          <w:tcPr>
-            <w:tcW w:type="dxa" w:w="2592"/>
-          </w:tcPr>
-          <w:p>
-            <w:r>
-              <w:rPr>
-                <w:sz w:val="20"/>
-              </w:rPr>
-              <w:t>SPN can create workspaces/connections</w:t>
-            </w:r>
-          </w:p>
-        </w:tc>
-        <w:tc>
-          <w:tcPr>
-            <w:tcW w:type="dxa" w:w="6336"/>
-          </w:tcPr>
-          <w:p>
-            <w:r>
-              <w:rPr>
-                <w:sz w:val="20"/>
-              </w:rPr>
-              <w:t>Tenant setting ‘ServicePrincipalAccessGlobalAPIs’ = True</w:t>
-            </w:r>
-          </w:p>
-        </w:tc>
-        <w:tc>
-          <w:tcPr>
-            <w:tcW w:type="dxa" w:w="864"/>
-          </w:tcPr>
-          <w:p>
-            <w:r>
-              <w:rPr>
-                <w:sz w:val="20"/>
-              </w:rPr>
-              <w:t>PASS</w:t>
-            </w:r>
-          </w:p>
-        </w:tc>
-      </w:tr>
-      <w:tr>
-        <w:tc>
-          <w:tcPr>
-            <w:tcW w:type="dxa" w:w="2592"/>
-          </w:tcPr>
-          <w:p>
-            <w:r>
-              <w:rPr>
-                <w:sz w:val="20"/>
-              </w:rPr>
-              <w:t>Related existing asset</w:t>
-            </w:r>
-          </w:p>
-        </w:tc>
-        <w:tc>
-          <w:tcPr>
-            <w:tcW w:type="dxa" w:w="6336"/>
-          </w:tcPr>
-          <w:p>
-            <w:r>
-              <w:rPr>
-                <w:sz w:val="20"/>
-              </w:rPr>
-              <w:t>An on-prem/Arc-enabled SQL Server database ‘AutoInsuranceDW’ was found (host LAPTOP-LQVSA8VE) — may be a useful source or reference schema for synthetic auto claims data; confirm before using as a live source.</w:t>
-            </w:r>
-          </w:p>
-        </w:tc>
-        <w:tc>
-          <w:tcPr>
-            <w:tcW w:type="dxa" w:w="864"/>
-          </w:tcPr>
-          <w:p>
-            <w:r>
-              <w:rPr>
-                <w:sz w:val="20"/>
-              </w:rPr>
-              <w:t>INFO</w:t>
-            </w:r>
-          </w:p>
-        </w:tc>
-      </w:tr>
-    </w:tbl>
-    <w:p>
-      <w:pPr>
-        <w:pStyle w:val="Heading2"/>
-      </w:pPr>
-      <w:r>
-        <w:t>B.3 Microsoft Foundry (RG_openai)</w:t>
-      </w:r>
-    </w:p>
-    <w:tbl>
-      <w:tblPr>
-        <w:tblStyle w:val="TableGrid"/>
-        <w:tblW w:type="auto" w:w="0"/>
-        <w:jc w:val="center"/>
-        <w:tblLook w:firstColumn="1" w:firstRow="1" w:lastColumn="0" w:lastRow="0" w:noHBand="0" w:noVBand="1" w:val="04A0"/>
-      </w:tblPr>
-      <w:tblGrid>
-        <w:gridCol w:w="2880"/>
-        <w:gridCol w:w="2880"/>
-        <w:gridCol w:w="2880"/>
-      </w:tblGrid>
-      <w:tr>
-        <w:tc>
-          <w:tcPr>
-            <w:tcW w:type="dxa" w:w="3744"/>
-            <w:shd w:fill="1F4E78"/>
-          </w:tcPr>
-          <w:p>
-            <w:r>
-              <w:rPr>
-                <w:b/>
-                <w:color w:val="FFFFFF"/>
-                <w:sz w:val="20"/>
-              </w:rPr>
-              <w:t>Item</w:t>
-            </w:r>
-          </w:p>
-        </w:tc>
-        <w:tc>
-          <w:tcPr>
-            <w:tcW w:type="dxa" w:w="5184"/>
-            <w:shd w:fill="1F4E78"/>
-          </w:tcPr>
-          <w:p>
-            <w:r>
-              <w:rPr>
-                <w:b/>
-                <w:color w:val="FFFFFF"/>
-                <w:sz w:val="20"/>
-              </w:rPr>
-              <w:t>Result</w:t>
-            </w:r>
-          </w:p>
-        </w:tc>
-        <w:tc>
-          <w:tcPr>
-            <w:tcW w:type="dxa" w:w="864"/>
-            <w:shd w:fill="1F4E78"/>
-          </w:tcPr>
-          <w:p>
-            <w:r>
-              <w:rPr>
-                <w:b/>
-                <w:color w:val="FFFFFF"/>
-                <w:sz w:val="20"/>
-              </w:rPr>
-              <w:t>Status</w:t>
-            </w:r>
-          </w:p>
-        </w:tc>
-      </w:tr>
-      <w:tr>
-        <w:tc>
-          <w:tcPr>
-            <w:tcW w:type="dxa" w:w="3744"/>
-          </w:tcPr>
-          <w:p>
-            <w:r>
-              <w:rPr>
-                <w:sz w:val="20"/>
-              </w:rPr>
-              <w:t>AI Foundry account with chat model</w:t>
-            </w:r>
-          </w:p>
-        </w:tc>
-        <w:tc>
-          <w:tcPr>
-            <w:tcW w:type="dxa" w:w="5184"/>
-          </w:tcPr>
-          <w:p>
-            <w:r>
-              <w:rPr>
-                <w:sz w:val="20"/>
-              </w:rPr>
-              <w:t>sbazureaimodels (westus3) has model deployments: gpt-4o and text-embedding-ada-002</w:t>
-            </w:r>
-          </w:p>
-        </w:tc>
-        <w:tc>
-          <w:tcPr>
-            <w:tcW w:type="dxa" w:w="864"/>
-          </w:tcPr>
-          <w:p>
-            <w:r>
-              <w:rPr>
-                <w:sz w:val="20"/>
-              </w:rPr>
-              <w:t>PASS</w:t>
-            </w:r>
-          </w:p>
-        </w:tc>
-      </w:tr>
-      <w:tr>
-        <w:tc>
-          <w:tcPr>
-            <w:tcW w:type="dxa" w:w="3744"/>
-          </w:tcPr>
-          <w:p>
-            <w:r>
-              <w:rPr>
-                <w:sz w:val="20"/>
-              </w:rPr>
-              <w:t>AI Foundry project</w:t>
-            </w:r>
-          </w:p>
-        </w:tc>
-        <w:tc>
-          <w:tcPr>
-            <w:tcW w:type="dxa" w:w="5184"/>
-          </w:tcPr>
-          <w:p>
-            <w:r>
-              <w:rPr>
-                <w:sz w:val="20"/>
-              </w:rPr>
-              <w:t>sbazureaimodels/sbazureaimodels-project01 project exists; a second account sagarbathe-westus (westus) with project sagarbathe-westus-pgr_usecase also exists</w:t>
-            </w:r>
-          </w:p>
-        </w:tc>
-        <w:tc>
-          <w:tcPr>
-            <w:tcW w:type="dxa" w:w="864"/>
-          </w:tcPr>
-          <w:p>
-            <w:r>
-              <w:rPr>
-                <w:sz w:val="20"/>
-              </w:rPr>
-              <w:t>PASS</w:t>
-            </w:r>
-          </w:p>
-        </w:tc>
-      </w:tr>
-      <w:tr>
-        <w:tc>
-          <w:tcPr>
-            <w:tcW w:type="dxa" w:w="3744"/>
-          </w:tcPr>
-          <w:p>
-            <w:r>
-              <w:rPr>
-                <w:sz w:val="20"/>
-              </w:rPr>
-              <w:t>Azure AI Search (for RAG knowledge base)</w:t>
-            </w:r>
-          </w:p>
-        </w:tc>
-        <w:tc>
-          <w:tcPr>
-            <w:tcW w:type="dxa" w:w="5184"/>
-          </w:tcPr>
-          <w:p>
-            <w:r>
-              <w:rPr>
-                <w:sz w:val="20"/>
-              </w:rPr>
-              <w:t>sb-aisearch01 found in RG_openai</w:t>
-            </w:r>
-          </w:p>
-        </w:tc>
-        <w:tc>
-          <w:tcPr>
-            <w:tcW w:type="dxa" w:w="864"/>
-          </w:tcPr>
-          <w:p>
-            <w:r>
-              <w:rPr>
-                <w:sz w:val="20"/>
-              </w:rPr>
-              <w:t>PASS</w:t>
-            </w:r>
-          </w:p>
-        </w:tc>
-      </w:tr>
-      <w:tr>
-        <w:tc>
-          <w:tcPr>
-            <w:tcW w:type="dxa" w:w="3744"/>
-          </w:tcPr>
-          <w:p>
-            <w:r>
-              <w:rPr>
-                <w:sz w:val="20"/>
-              </w:rPr>
-              <w:t>Document Intelligence (optional, for FNOL form/photo parsing)</w:t>
-            </w:r>
-          </w:p>
-        </w:tc>
-        <w:tc>
-          <w:tcPr>
-            <w:tcW w:type="dxa" w:w="5184"/>
-          </w:tcPr>
-          <w:p>
-            <w:r>
-              <w:rPr>
-                <w:sz w:val="20"/>
-              </w:rPr>
-              <w:t>sb-docint (Form Recognizer) found in RG_openai (eastus)</w:t>
-            </w:r>
-          </w:p>
-        </w:tc>
-        <w:tc>
-          <w:tcPr>
-            <w:tcW w:type="dxa" w:w="864"/>
-          </w:tcPr>
-          <w:p>
-            <w:r>
-              <w:rPr>
-                <w:sz w:val="20"/>
-              </w:rPr>
-              <w:t>PASS</w:t>
-            </w:r>
-          </w:p>
-        </w:tc>
-      </w:tr>
-      <w:tr>
-        <w:tc>
-          <w:tcPr>
-            <w:tcW w:type="dxa" w:w="3744"/>
-          </w:tcPr>
-          <w:p>
-            <w:r>
-              <w:rPr>
-                <w:sz w:val="20"/>
-              </w:rPr>
-              <w:t>Key Vault for secrets</w:t>
-            </w:r>
-          </w:p>
-        </w:tc>
-        <w:tc>
-          <w:tcPr>
-            <w:tcW w:type="dxa" w:w="5184"/>
-          </w:tcPr>
-          <w:p>
-            <w:r>
-              <w:rPr>
-                <w:sz w:val="20"/>
-              </w:rPr>
-              <w:t>sbazureai6678013605 found in RG_openai</w:t>
-            </w:r>
-          </w:p>
-        </w:tc>
-        <w:tc>
-          <w:tcPr>
-            <w:tcW w:type="dxa" w:w="864"/>
-          </w:tcPr>
-          <w:p>
-            <w:r>
-              <w:rPr>
-                <w:sz w:val="20"/>
-              </w:rPr>
-              <w:t>PASS</w:t>
-            </w:r>
-          </w:p>
-        </w:tc>
-      </w:tr>
-    </w:tbl>
-    <w:p>
-      <w:pPr>
-        <w:pStyle w:val="Heading2"/>
-      </w:pPr>
-      <w:r>
-        <w:t>B.4 Microsoft Copilot Studio &amp; Power Platform</w:t>
-      </w:r>
-    </w:p>
-    <w:tbl>
-      <w:tblPr>
-        <w:tblStyle w:val="TableGrid"/>
-        <w:tblW w:type="auto" w:w="0"/>
-        <w:jc w:val="center"/>
-        <w:tblLook w:firstColumn="1" w:firstRow="1" w:lastColumn="0" w:lastRow="0" w:noHBand="0" w:noVBand="1" w:val="04A0"/>
-      </w:tblPr>
-      <w:tblGrid>
-        <w:gridCol w:w="2880"/>
-        <w:gridCol w:w="2880"/>
-        <w:gridCol w:w="2880"/>
-      </w:tblGrid>
-      <w:tr>
-        <w:tc>
-          <w:tcPr>
-            <w:tcW w:type="dxa" w:w="3168"/>
-            <w:shd w:fill="1F4E78"/>
-          </w:tcPr>
-          <w:p>
-            <w:r>
-              <w:rPr>
-                <w:b/>
-                <w:color w:val="FFFFFF"/>
-                <w:sz w:val="20"/>
-              </w:rPr>
-              <w:t>Item</w:t>
-            </w:r>
-          </w:p>
-        </w:tc>
-        <w:tc>
-          <w:tcPr>
-            <w:tcW w:type="dxa" w:w="5760"/>
-            <w:shd w:fill="1F4E78"/>
-          </w:tcPr>
-          <w:p>
-            <w:r>
-              <w:rPr>
-                <w:b/>
-                <w:color w:val="FFFFFF"/>
-                <w:sz w:val="20"/>
-              </w:rPr>
-              <w:t>Result</w:t>
-            </w:r>
-          </w:p>
-        </w:tc>
-        <w:tc>
-          <w:tcPr>
-            <w:tcW w:type="dxa" w:w="864"/>
-            <w:shd w:fill="1F4E78"/>
-          </w:tcPr>
-          <w:p>
-            <w:r>
-              <w:rPr>
-                <w:b/>
-                <w:color w:val="FFFFFF"/>
-                <w:sz w:val="20"/>
-              </w:rPr>
-              <w:t>Status</w:t>
-            </w:r>
-          </w:p>
-        </w:tc>
-      </w:tr>
-      <w:tr>
-        <w:tc>
-          <w:tcPr>
-            <w:tcW w:type="dxa" w:w="3168"/>
-          </w:tcPr>
-          <w:p>
-            <w:r>
-              <w:rPr>
-                <w:sz w:val="20"/>
-              </w:rPr>
-              <w:t>Dataverse-enabled environment</w:t>
-            </w:r>
-          </w:p>
-        </w:tc>
-        <w:tc>
-          <w:tcPr>
-            <w:tcW w:type="dxa" w:w="5760"/>
-          </w:tcPr>
-          <w:p>
-            <w:r>
-              <w:rPr>
-                <w:sz w:val="20"/>
-              </w:rPr>
-              <w:t>‘Contoso (default)’ environment found with Dataverse = Yes</w:t>
-            </w:r>
-          </w:p>
-        </w:tc>
-        <w:tc>
-          <w:tcPr>
-            <w:tcW w:type="dxa" w:w="864"/>
-          </w:tcPr>
-          <w:p>
-            <w:r>
-              <w:rPr>
-                <w:sz w:val="20"/>
-              </w:rPr>
-              <w:t>PASS</w:t>
-            </w:r>
-          </w:p>
-        </w:tc>
-      </w:tr>
-      <w:tr>
-        <w:tc>
-          <w:tcPr>
-            <w:tcW w:type="dxa" w:w="3168"/>
-          </w:tcPr>
-          <w:p>
-            <w:r>
-              <w:rPr>
-                <w:sz w:val="20"/>
-              </w:rPr>
-              <w:t>Copilot Studio license</w:t>
-            </w:r>
-          </w:p>
-        </w:tc>
-        <w:tc>
-          <w:tcPr>
-            <w:tcW w:type="dxa" w:w="5760"/>
-          </w:tcPr>
-          <w:p>
-            <w:r>
-              <w:rPr>
-                <w:sz w:val="20"/>
-              </w:rPr>
-              <w:t>SKU CCIBOTS_PRIVPREV_VIRAL present, 10,000 enabled / 2 consumed (preview/trial SKU — verify this covers production-grade usage before go-live)</w:t>
-            </w:r>
-          </w:p>
-        </w:tc>
-        <w:tc>
-          <w:tcPr>
-            <w:tcW w:type="dxa" w:w="864"/>
-          </w:tcPr>
-          <w:p>
-            <w:r>
-              <w:rPr>
-                <w:sz w:val="20"/>
-              </w:rPr>
-              <w:t>PASS (verify tier)</w:t>
-            </w:r>
-          </w:p>
-        </w:tc>
-      </w:tr>
-      <w:tr>
-        <w:tc>
-          <w:tcPr>
-            <w:tcW w:type="dxa" w:w="3168"/>
-          </w:tcPr>
-          <w:p>
-            <w:r>
-              <w:rPr>
-                <w:sz w:val="20"/>
-              </w:rPr>
-              <w:t>Power Automate capability</w:t>
-            </w:r>
-          </w:p>
-        </w:tc>
-        <w:tc>
-          <w:tcPr>
-            <w:tcW w:type="dxa" w:w="5760"/>
-          </w:tcPr>
-          <w:p>
-            <w:r>
-              <w:rPr>
-                <w:sz w:val="20"/>
-              </w:rPr>
-              <w:t>FLOW_FREE present (10,000 enabled); no dedicated per-user premium plan detected — confirm the Dataverse-connected flow's premium connector needs are covered</w:t>
-            </w:r>
-          </w:p>
-        </w:tc>
-        <w:tc>
-          <w:tcPr>
-            <w:tcW w:type="dxa" w:w="864"/>
-          </w:tcPr>
-          <w:p>
-            <w:r>
-              <w:rPr>
-                <w:sz w:val="20"/>
-              </w:rPr>
-              <w:t>ACTION NEEDED</w:t>
-            </w:r>
-          </w:p>
-        </w:tc>
-      </w:tr>
-    </w:tbl>
-    <w:p>
-      <w:pPr>
-        <w:pStyle w:val="Heading2"/>
-      </w:pPr>
-      <w:r>
-        <w:t>B.5 Work IQ / Microsoft 365 licensing</w:t>
-      </w:r>
-    </w:p>
-    <w:tbl>
-      <w:tblPr>
-        <w:tblStyle w:val="TableGrid"/>
-        <w:tblW w:type="auto" w:w="0"/>
-        <w:jc w:val="center"/>
-        <w:tblLook w:firstColumn="1" w:firstRow="1" w:lastColumn="0" w:lastRow="0" w:noHBand="0" w:noVBand="1" w:val="04A0"/>
-      </w:tblPr>
-      <w:tblGrid>
-        <w:gridCol w:w="1728"/>
-        <w:gridCol w:w="1728"/>
-        <w:gridCol w:w="1728"/>
-        <w:gridCol w:w="1728"/>
-        <w:gridCol w:w="1728"/>
-      </w:tblGrid>
-      <w:tr>
-        <w:tc>
-          <w:tcPr>
-            <w:tcW w:type="dxa" w:w="3456"/>
-            <w:shd w:fill="1F4E78"/>
-          </w:tcPr>
-          <w:p>
-            <w:r>
-              <w:rPr>
-                <w:b/>
-                <w:color w:val="FFFFFF"/>
-                <w:sz w:val="20"/>
-              </w:rPr>
-              <w:t>SKU</w:t>
-            </w:r>
-          </w:p>
-        </w:tc>
-        <w:tc>
-          <w:tcPr>
-            <w:tcW w:type="dxa" w:w="1440"/>
-            <w:shd w:fill="1F4E78"/>
-          </w:tcPr>
-          <w:p>
-            <w:r>
-              <w:rPr>
-                <w:b/>
-                <w:color w:val="FFFFFF"/>
-                <w:sz w:val="20"/>
-              </w:rPr>
-              <w:t>Enabled</w:t>
-            </w:r>
-          </w:p>
-        </w:tc>
-        <w:tc>
-          <w:tcPr>
-            <w:tcW w:type="dxa" w:w="1440"/>
-            <w:shd w:fill="1F4E78"/>
-          </w:tcPr>
-          <w:p>
-            <w:r>
-              <w:rPr>
-                <w:b/>
-                <w:color w:val="FFFFFF"/>
-                <w:sz w:val="20"/>
-              </w:rPr>
-              <w:t>Consumed</w:t>
-            </w:r>
-          </w:p>
-        </w:tc>
-        <w:tc>
-          <w:tcPr>
-            <w:tcW w:type="dxa" w:w="1728"/>
-            <w:shd w:fill="1F4E78"/>
-          </w:tcPr>
-          <w:p>
-            <w:r>
-              <w:rPr>
-                <w:b/>
-                <w:color w:val="FFFFFF"/>
-                <w:sz w:val="20"/>
-              </w:rPr>
-              <w:t>Available</w:t>
-            </w:r>
-          </w:p>
-        </w:tc>
-        <w:tc>
-          <w:tcPr>
-            <w:tcW w:type="dxa" w:w="1728"/>
-            <w:shd w:fill="1F4E78"/>
-          </w:tcPr>
-          <w:p>
-            <w:r>
-              <w:rPr>
-                <w:b/>
-                <w:color w:val="FFFFFF"/>
-                <w:sz w:val="20"/>
-              </w:rPr>
-              <w:t>Status</w:t>
-            </w:r>
-          </w:p>
-        </w:tc>
-      </w:tr>
-      <w:tr>
-        <w:tc>
-          <w:tcPr>
-            <w:tcW w:type="dxa" w:w="3456"/>
-          </w:tcPr>
-          <w:p>
-            <w:r>
-              <w:rPr>
-                <w:sz w:val="20"/>
-              </w:rPr>
-              <w:t>Microsoft_365_E5_(no_Teams)</w:t>
-            </w:r>
-          </w:p>
-        </w:tc>
-        <w:tc>
-          <w:tcPr>
-            <w:tcW w:type="dxa" w:w="1440"/>
-          </w:tcPr>
-          <w:p>
-            <w:r>
-              <w:rPr>
-                <w:sz w:val="20"/>
-              </w:rPr>
-              <w:t>5</w:t>
-            </w:r>
-          </w:p>
-        </w:tc>
-        <w:tc>
-          <w:tcPr>
-            <w:tcW w:type="dxa" w:w="1440"/>
-          </w:tcPr>
-          <w:p>
-            <w:r>
-              <w:rPr>
-                <w:sz w:val="20"/>
-              </w:rPr>
-              <w:t>3</w:t>
-            </w:r>
-          </w:p>
-        </w:tc>
-        <w:tc>
-          <w:tcPr>
-            <w:tcW w:type="dxa" w:w="1728"/>
-          </w:tcPr>
-          <w:p>
-            <w:r>
-              <w:rPr>
-                <w:sz w:val="20"/>
-              </w:rPr>
-              <w:t>2</w:t>
-            </w:r>
-          </w:p>
-        </w:tc>
-        <w:tc>
-          <w:tcPr>
-            <w:tcW w:type="dxa" w:w="1728"/>
-          </w:tcPr>
-          <w:p>
-            <w:r>
-              <w:rPr>
-                <w:sz w:val="20"/>
-              </w:rPr>
-              <w:t>PASS</w:t>
-            </w:r>
-          </w:p>
-        </w:tc>
-      </w:tr>
-      <w:tr>
-        <w:tc>
-          <w:tcPr>
-            <w:tcW w:type="dxa" w:w="3456"/>
-          </w:tcPr>
-          <w:p>
-            <w:r>
-              <w:rPr>
-                <w:sz w:val="20"/>
-              </w:rPr>
-              <w:t>Microsoft_Teams_Enterprise_New</w:t>
-            </w:r>
-          </w:p>
-        </w:tc>
-        <w:tc>
-          <w:tcPr>
-            <w:tcW w:type="dxa" w:w="1440"/>
-          </w:tcPr>
-          <w:p>
-            <w:r>
-              <w:rPr>
-                <w:sz w:val="20"/>
-              </w:rPr>
-              <w:t>5</w:t>
-            </w:r>
-          </w:p>
-        </w:tc>
-        <w:tc>
-          <w:tcPr>
-            <w:tcW w:type="dxa" w:w="1440"/>
-          </w:tcPr>
-          <w:p>
-            <w:r>
-              <w:rPr>
-                <w:sz w:val="20"/>
-              </w:rPr>
-              <w:t>2</w:t>
-            </w:r>
-          </w:p>
-        </w:tc>
-        <w:tc>
-          <w:tcPr>
-            <w:tcW w:type="dxa" w:w="1728"/>
-          </w:tcPr>
-          <w:p>
-            <w:r>
-              <w:rPr>
-                <w:sz w:val="20"/>
-              </w:rPr>
-              <w:t>3</w:t>
-            </w:r>
-          </w:p>
-        </w:tc>
-        <w:tc>
-          <w:tcPr>
-            <w:tcW w:type="dxa" w:w="1728"/>
-          </w:tcPr>
-          <w:p>
-            <w:r>
-              <w:rPr>
-                <w:sz w:val="20"/>
-              </w:rPr>
-              <w:t>PASS</w:t>
-            </w:r>
-          </w:p>
-        </w:tc>
-      </w:tr>
-      <w:tr>
-        <w:tc>
-          <w:tcPr>
-            <w:tcW w:type="dxa" w:w="3456"/>
-          </w:tcPr>
-          <w:p>
-            <w:r>
-              <w:rPr>
-                <w:sz w:val="20"/>
-              </w:rPr>
-              <w:t>Microsoft_365_Copilot</w:t>
-            </w:r>
-          </w:p>
-        </w:tc>
-        <w:tc>
-          <w:tcPr>
-            <w:tcW w:type="dxa" w:w="1440"/>
-          </w:tcPr>
-          <w:p>
-            <w:r>
-              <w:rPr>
-                <w:sz w:val="20"/>
-              </w:rPr>
-              <w:t>5</w:t>
-            </w:r>
-          </w:p>
-        </w:tc>
-        <w:tc>
-          <w:tcPr>
-            <w:tcW w:type="dxa" w:w="1440"/>
-          </w:tcPr>
-          <w:p>
-            <w:r>
-              <w:rPr>
-                <w:sz w:val="20"/>
-              </w:rPr>
-              <w:t>1</w:t>
-            </w:r>
-          </w:p>
-        </w:tc>
-        <w:tc>
-          <w:tcPr>
-            <w:tcW w:type="dxa" w:w="1728"/>
-          </w:tcPr>
-          <w:p>
-            <w:r>
-              <w:rPr>
-                <w:sz w:val="20"/>
-              </w:rPr>
-              <w:t>4</w:t>
-            </w:r>
-          </w:p>
-        </w:tc>
-        <w:tc>
-          <w:tcPr>
-            <w:tcW w:type="dxa" w:w="1728"/>
-          </w:tcPr>
-          <w:p>
-            <w:r>
-              <w:rPr>
-                <w:sz w:val="20"/>
-              </w:rPr>
-              <w:t>PASS</w:t>
-            </w:r>
-          </w:p>
-        </w:tc>
-      </w:tr>
-      <w:tr>
-        <w:tc>
-          <w:tcPr>
-            <w:tcW w:type="dxa" w:w="3456"/>
-          </w:tcPr>
-          <w:p>
-            <w:r>
-              <w:rPr>
-                <w:sz w:val="20"/>
-              </w:rPr>
-              <w:t>POWER_BI_STANDARD</w:t>
-            </w:r>
-          </w:p>
-        </w:tc>
-        <w:tc>
-          <w:tcPr>
-            <w:tcW w:type="dxa" w:w="1440"/>
-          </w:tcPr>
-          <w:p>
-            <w:r>
-              <w:rPr>
-                <w:sz w:val="20"/>
-              </w:rPr>
-              <w:t>1,000,000</w:t>
-            </w:r>
-          </w:p>
-        </w:tc>
-        <w:tc>
-          <w:tcPr>
-            <w:tcW w:type="dxa" w:w="1440"/>
-          </w:tcPr>
-          <w:p>
-            <w:r>
-              <w:rPr>
-                <w:sz w:val="20"/>
-              </w:rPr>
-              <w:t>14</w:t>
-            </w:r>
-          </w:p>
-        </w:tc>
-        <w:tc>
-          <w:tcPr>
-            <w:tcW w:type="dxa" w:w="1728"/>
-          </w:tcPr>
-          <w:p>
-            <w:r>
-              <w:rPr>
-                <w:sz w:val="20"/>
-              </w:rPr>
-              <w:t>n/a (free SKU)</w:t>
-            </w:r>
-          </w:p>
-        </w:tc>
-        <w:tc>
-          <w:tcPr>
-            <w:tcW w:type="dxa" w:w="1728"/>
-          </w:tcPr>
-          <w:p>
-            <w:r>
-              <w:rPr>
-                <w:sz w:val="20"/>
-              </w:rPr>
-              <w:t>INFO — not a blocker; Fabric capacity is used instead of Power BI Premium</w:t>
-            </w:r>
-          </w:p>
-        </w:tc>
-      </w:tr>
-    </w:tbl>
-    <w:p>
-      <w:pPr>
-        <w:pStyle w:val="Heading2"/>
-      </w:pPr>
-      <w:r>
-        <w:t>B.6 Existing tenant assets relevant to this build</w:t>
-      </w:r>
-    </w:p>
-    <w:p>
-      <w:r>
-        <w:t>The following pre-existing objects were discovered in the tenant and may accelerate this build. None are used automatically — please confirm before reuse:</w:t>
-      </w:r>
-    </w:p>
-    <w:p>
-      <w:pPr>
-        <w:pStyle w:val="ListBullet"/>
-      </w:pPr>
-      <w:r>
-        <w:t>Mailbox ‘fabric-svc-email@mngenvmcap146722.onmicrosoft.com’ (“Fabric Pipeline Service”) — already used as a generic service mailbox in a prior accelerator; could double as the FNOL intake mailbox or a new dedicated mailbox can be created instead.</w:t>
-      </w:r>
-    </w:p>
-    <w:p>
-      <w:pPr>
-        <w:pStyle w:val="ListBullet"/>
-      </w:pPr>
-      <w:r>
-        <w:t>Users ‘autoclaims_eaststates_user01’ and ‘autoclaims_southstates_user01’ — look like pre-provisioned adjuster personas from a prior auto-claims exercise; could be reused to represent regional adjusters.</w:t>
-      </w:r>
-    </w:p>
-    <w:p>
-      <w:pPr>
-        <w:pStyle w:val="ListBullet"/>
-      </w:pPr>
-      <w:r>
-        <w:t>Fabric workspace ‘WS_AutoClaimsPOC’ — possible prior proof-of-concept workspace for auto claims; review contents before deciding to reuse vs. create a fresh workspace.</w:t>
-      </w:r>
-    </w:p>
-    <w:p>
-      <w:pPr>
-        <w:pStyle w:val="ListBullet"/>
-      </w:pPr>
-      <w:r>
-        <w:t>Logic App ‘la-fabric-send-email’ in RG_Fabric — from the earlier SPN email-notification accelerator; not part of this Copilot Studio-based design, but available if a fallback email-sending mechanism is ever needed.</w:t>
-      </w:r>
-    </w:p>
-    <w:p>
-      <w:pPr>
-        <w:pStyle w:val="Heading1"/>
-      </w:pPr>
-      <w:r>
-        <w:t>Summary</w:t>
+        <w:t>Before starting deployment (see the Deployment Guide), confirm the following in your own tenant. These are the same checks the accelerator author ran (via Azure CLI / Microsoft Graph) before building this solution - run them against your own subscription/tenant rather than assuming.</w:t>
       </w:r>
     </w:p>
     <w:tbl>
@@ -1669,7 +291,7 @@
       <w:tr>
         <w:tc>
           <w:tcPr>
-            <w:tcW w:type="dxa" w:w="5040"/>
+            <w:tcW w:type="dxa" w:w="3168"/>
             <w:shd w:fill="1F4E78"/>
           </w:tcPr>
           <w:p>
@@ -1685,7 +307,7 @@
         </w:tc>
         <w:tc>
           <w:tcPr>
-            <w:tcW w:type="dxa" w:w="4896"/>
+            <w:tcW w:type="dxa" w:w="6912"/>
             <w:shd w:fill="1F4E78"/>
           </w:tcPr>
           <w:p>
@@ -1695,7 +317,7 @@
                 <w:color w:val="FFFFFF"/>
                 <w:sz w:val="20"/>
               </w:rPr>
-              <w:t>Overall Status</w:t>
+              <w:t>What to verify</w:t>
             </w:r>
           </w:p>
         </w:tc>
@@ -1703,7 +325,7 @@
       <w:tr>
         <w:tc>
           <w:tcPr>
-            <w:tcW w:type="dxa" w:w="5040"/>
+            <w:tcW w:type="dxa" w:w="3168"/>
           </w:tcPr>
           <w:p>
             <w:r>
@@ -1716,14 +338,14 @@
         </w:tc>
         <w:tc>
           <w:tcPr>
-            <w:tcW w:type="dxa" w:w="4896"/>
+            <w:tcW w:type="dxa" w:w="6912"/>
           </w:tcPr>
           <w:p>
             <w:r>
               <w:rPr>
                 <w:sz w:val="20"/>
               </w:rPr>
-              <w:t>Ready</w:t>
+              <w:t>az account show confirms the target subscription is Enabled and you have Owner or Contributor + User Access Administrator on it.</w:t>
             </w:r>
           </w:p>
         </w:tc>
@@ -1731,27 +353,27 @@
       <w:tr>
         <w:tc>
           <w:tcPr>
-            <w:tcW w:type="dxa" w:w="5040"/>
+            <w:tcW w:type="dxa" w:w="3168"/>
           </w:tcPr>
           <w:p>
             <w:r>
               <w:rPr>
                 <w:sz w:val="20"/>
               </w:rPr>
-              <w:t>Microsoft Fabric (RG_Fabric)</w:t>
+              <w:t>Resource providers</w:t>
             </w:r>
           </w:p>
         </w:tc>
         <w:tc>
           <w:tcPr>
-            <w:tcW w:type="dxa" w:w="4896"/>
+            <w:tcW w:type="dxa" w:w="6912"/>
           </w:tcPr>
           <w:p>
             <w:r>
               <w:rPr>
                 <w:sz w:val="20"/>
               </w:rPr>
-              <w:t>Ready — pick/confirm workspace</w:t>
+              <w:t>az provider show for CognitiveServices, Search, KeyVault, App, ManagedIdentity, Fabric, OperationalInsights, Insights, Web all report Registered.</w:t>
             </w:r>
           </w:p>
         </w:tc>
@@ -1759,27 +381,27 @@
       <w:tr>
         <w:tc>
           <w:tcPr>
-            <w:tcW w:type="dxa" w:w="5040"/>
+            <w:tcW w:type="dxa" w:w="3168"/>
           </w:tcPr>
           <w:p>
             <w:r>
               <w:rPr>
                 <w:sz w:val="20"/>
               </w:rPr>
-              <w:t>Microsoft Foundry (RG_openai)</w:t>
+              <w:t>Fabric capacity &amp; workspace</w:t>
             </w:r>
           </w:p>
         </w:tc>
         <w:tc>
           <w:tcPr>
-            <w:tcW w:type="dxa" w:w="4896"/>
+            <w:tcW w:type="dxa" w:w="6912"/>
           </w:tcPr>
           <w:p>
             <w:r>
               <w:rPr>
                 <w:sz w:val="20"/>
               </w:rPr>
-              <w:t>Ready — no new resources required</w:t>
+              <w:t>At least one Fabric capacity is Active and assigned (or assignable) to a workspace; the workspace does not already contain an unrelated lakehouse of the same name you plan to use.</w:t>
             </w:r>
           </w:p>
         </w:tc>
@@ -1787,27 +409,27 @@
       <w:tr>
         <w:tc>
           <w:tcPr>
-            <w:tcW w:type="dxa" w:w="5040"/>
+            <w:tcW w:type="dxa" w:w="3168"/>
           </w:tcPr>
           <w:p>
             <w:r>
               <w:rPr>
                 <w:sz w:val="20"/>
               </w:rPr>
-              <w:t>Copilot Studio &amp; Power Platform</w:t>
+              <w:t>Fabric SPN settings (if automating)</w:t>
             </w:r>
           </w:p>
         </w:tc>
         <w:tc>
           <w:tcPr>
-            <w:tcW w:type="dxa" w:w="4896"/>
+            <w:tcW w:type="dxa" w:w="6912"/>
           </w:tcPr>
           <w:p>
             <w:r>
               <w:rPr>
                 <w:sz w:val="20"/>
               </w:rPr>
-              <w:t>Ready — verify Power Automate premium coverage</w:t>
+              <w:t>Fabric Admin portal → Tenant settings confirms ‘Service principals can call Fabric public APIs’ and, if needed, ‘Service principals can access read-only admin APIs’ are enabled for your tenant.</w:t>
             </w:r>
           </w:p>
         </w:tc>
@@ -1815,27 +437,111 @@
       <w:tr>
         <w:tc>
           <w:tcPr>
-            <w:tcW w:type="dxa" w:w="5040"/>
+            <w:tcW w:type="dxa" w:w="3168"/>
           </w:tcPr>
           <w:p>
             <w:r>
               <w:rPr>
                 <w:sz w:val="20"/>
               </w:rPr>
-              <w:t>Work IQ / Microsoft 365 licensing</w:t>
+              <w:t>Foundry project &amp; model deployments</w:t>
             </w:r>
           </w:p>
         </w:tc>
         <w:tc>
           <w:tcPr>
-            <w:tcW w:type="dxa" w:w="4896"/>
+            <w:tcW w:type="dxa" w:w="6912"/>
           </w:tcPr>
           <w:p>
             <w:r>
               <w:rPr>
                 <w:sz w:val="20"/>
               </w:rPr>
-              <w:t>Ready</w:t>
+              <w:t>Your Azure AI Foundry project has the chat and embedding model deployments named in .env (or update .env to match your deployment names), with sufficient TPM/RPM quota.</w:t>
+            </w:r>
+          </w:p>
+        </w:tc>
+      </w:tr>
+      <w:tr>
+        <w:tc>
+          <w:tcPr>
+            <w:tcW w:type="dxa" w:w="3168"/>
+          </w:tcPr>
+          <w:p>
+            <w:r>
+              <w:rPr>
+                <w:sz w:val="20"/>
+              </w:rPr>
+              <w:t>Azure AI Search</w:t>
+            </w:r>
+          </w:p>
+        </w:tc>
+        <w:tc>
+          <w:tcPr>
+            <w:tcW w:type="dxa" w:w="6912"/>
+          </w:tcPr>
+          <w:p>
+            <w:r>
+              <w:rPr>
+                <w:sz w:val="20"/>
+              </w:rPr>
+              <w:t>The Search service is reachable and has capacity for an additional index (auto-fnol-kb-index by default).</w:t>
+            </w:r>
+          </w:p>
+        </w:tc>
+      </w:tr>
+      <w:tr>
+        <w:tc>
+          <w:tcPr>
+            <w:tcW w:type="dxa" w:w="3168"/>
+          </w:tcPr>
+          <w:p>
+            <w:r>
+              <w:rPr>
+                <w:sz w:val="20"/>
+              </w:rPr>
+              <w:t>Power Platform / Copilot Studio</w:t>
+            </w:r>
+          </w:p>
+        </w:tc>
+        <w:tc>
+          <w:tcPr>
+            <w:tcW w:type="dxa" w:w="6912"/>
+          </w:tcPr>
+          <w:p>
+            <w:r>
+              <w:rPr>
+                <w:sz w:val="20"/>
+              </w:rPr>
+              <w:t>The target Dataverse environment exists and the deploying account has System Administrator; a Copilot Studio license is assigned to that account.</w:t>
+            </w:r>
+          </w:p>
+        </w:tc>
+      </w:tr>
+      <w:tr>
+        <w:tc>
+          <w:tcPr>
+            <w:tcW w:type="dxa" w:w="3168"/>
+          </w:tcPr>
+          <w:p>
+            <w:r>
+              <w:rPr>
+                <w:sz w:val="20"/>
+              </w:rPr>
+              <w:t>Microsoft 365 licensing</w:t>
+            </w:r>
+          </w:p>
+        </w:tc>
+        <w:tc>
+          <w:tcPr>
+            <w:tcW w:type="dxa" w:w="6912"/>
+          </w:tcPr>
+          <w:p>
+            <w:r>
+              <w:rPr>
+                <w:sz w:val="20"/>
+              </w:rPr>
+              <w:t>Adjuster/supervisor personas who will test the agent have Teams and (if desired) Microsoft 365 Copilot licenses assigned.</w:t>
             </w:r>
           </w:p>
         </w:tc>
@@ -1844,7 +550,7 @@
     <w:p/>
     <w:p>
       <w:r>
-        <w:t>Overall: the tenant is in good shape to build the Auto FNOL Triage accelerator using RG_openai for Foundry IQ and RG_Fabric for Fabric IQ. Two small decisions are needed before deployment: (1) which Fabric capacity/workspace to designate (new vs. reuse WS_AutoClaimsPOC), and (2) confirming the Power Automate/Copilot Studio license tier is adequate for the intended usage volume beyond the preview/trial SKUs currently present.</w:t>
+        <w:t>Once these are confirmed, proceed to documents/Auto_FNOL_Deployment_Guide.docx, starting with its “Configure Your Tenant (.env)” section to plug your own workspace/lakehouse IDs and service endpoints into config.py.</w:t>
       </w:r>
     </w:p>
     <w:p/>

</xml_diff>